<commit_message>
refactor: clean up old resume files and index versions
Remove deprecated ATS-specific resumes, old PDF versions, and outdated index v1.
Update index pages and resume documents with current versions.

Co-Authored-By: Claude Haiku 4.5 <noreply@anthropic.com>
</commit_message>
<xml_diff>
--- a/resume_en.docx
+++ b/resume_en.docx
@@ -6,7 +6,7 @@
       <w:pPr>
         <w:spacing w:after="45"/>
         <w:outlineLvl w:val="1"/>
-        <w:divId w:val="1383865863"/>
+        <w:divId w:val="423186738"/>
         <w:rPr>
           <w:rFonts w:ascii="Arial" w:eastAsia="Times New Roman" w:hAnsi="Arial" w:cs="Arial"/>
           <w:b/>
@@ -36,7 +36,7 @@
       <w:pPr>
         <w:spacing w:after="90"/>
         <w:outlineLvl w:val="2"/>
-        <w:divId w:val="1383865863"/>
+        <w:divId w:val="423186738"/>
         <w:rPr>
           <w:rFonts w:ascii="Arial" w:eastAsia="Times New Roman" w:hAnsi="Arial" w:cs="Arial"/>
           <w:color w:val="000000"/>
@@ -58,7 +58,7 @@
     </w:p>
     <w:p>
       <w:pPr>
-        <w:divId w:val="1354844761"/>
+        <w:divId w:val="1992246894"/>
         <w:rPr>
           <w:rFonts w:ascii="Arial" w:eastAsia="Times New Roman" w:hAnsi="Arial" w:cs="Arial"/>
           <w:color w:val="000000"/>
@@ -134,7 +134,7 @@
     <w:p>
       <w:pPr>
         <w:pStyle w:val="Heading3"/>
-        <w:divId w:val="2118285498"/>
+        <w:divId w:val="460535235"/>
         <w:rPr>
           <w:rFonts w:ascii="Arial" w:eastAsia="Times New Roman" w:hAnsi="Arial" w:cs="Arial"/>
           <w:lang w:val="en"/>
@@ -151,7 +151,7 @@
     <w:p>
       <w:pPr>
         <w:pStyle w:val="NormalWeb"/>
-        <w:divId w:val="2118285498"/>
+        <w:divId w:val="460535235"/>
         <w:rPr>
           <w:rFonts w:ascii="Arial" w:hAnsi="Arial" w:cs="Arial"/>
           <w:color w:val="000000"/>
@@ -174,7 +174,7 @@
     <w:p>
       <w:pPr>
         <w:pStyle w:val="Heading3"/>
-        <w:divId w:val="1494492991"/>
+        <w:divId w:val="460466936"/>
         <w:rPr>
           <w:rFonts w:ascii="Arial" w:eastAsia="Times New Roman" w:hAnsi="Arial" w:cs="Arial"/>
           <w:lang w:val="en"/>
@@ -195,7 +195,7 @@
           <w:numId w:val="1"/>
         </w:numPr>
         <w:spacing w:before="100" w:beforeAutospacing="1" w:after="30"/>
-        <w:divId w:val="1494492991"/>
+        <w:divId w:val="460466936"/>
         <w:rPr>
           <w:rFonts w:ascii="Arial" w:eastAsia="Times New Roman" w:hAnsi="Arial" w:cs="Arial"/>
           <w:color w:val="000000"/>
@@ -243,7 +243,7 @@
           <w:numId w:val="1"/>
         </w:numPr>
         <w:spacing w:before="100" w:beforeAutospacing="1" w:after="30"/>
-        <w:divId w:val="1494492991"/>
+        <w:divId w:val="460466936"/>
         <w:rPr>
           <w:rFonts w:ascii="Arial" w:eastAsia="Times New Roman" w:hAnsi="Arial" w:cs="Arial"/>
           <w:color w:val="000000"/>
@@ -291,7 +291,7 @@
           <w:numId w:val="1"/>
         </w:numPr>
         <w:spacing w:before="100" w:beforeAutospacing="1" w:after="30"/>
-        <w:divId w:val="1494492991"/>
+        <w:divId w:val="460466936"/>
         <w:rPr>
           <w:rFonts w:ascii="Arial" w:eastAsia="Times New Roman" w:hAnsi="Arial" w:cs="Arial"/>
           <w:color w:val="000000"/>
@@ -325,7 +325,7 @@
     <w:p>
       <w:pPr>
         <w:pStyle w:val="Heading3"/>
-        <w:divId w:val="362943139"/>
+        <w:divId w:val="479421473"/>
         <w:rPr>
           <w:rFonts w:ascii="Arial" w:eastAsia="Times New Roman" w:hAnsi="Arial" w:cs="Arial"/>
           <w:lang w:val="en"/>
@@ -346,7 +346,7 @@
           <w:numId w:val="2"/>
         </w:numPr>
         <w:spacing w:before="100" w:beforeAutospacing="1" w:after="30"/>
-        <w:divId w:val="362943139"/>
+        <w:divId w:val="479421473"/>
         <w:rPr>
           <w:rFonts w:ascii="Arial" w:eastAsia="Times New Roman" w:hAnsi="Arial" w:cs="Arial"/>
           <w:color w:val="000000"/>
@@ -394,7 +394,7 @@
           <w:numId w:val="2"/>
         </w:numPr>
         <w:spacing w:before="100" w:beforeAutospacing="1" w:after="30"/>
-        <w:divId w:val="362943139"/>
+        <w:divId w:val="479421473"/>
         <w:rPr>
           <w:rFonts w:ascii="Arial" w:eastAsia="Times New Roman" w:hAnsi="Arial" w:cs="Arial"/>
           <w:color w:val="000000"/>
@@ -432,7 +432,7 @@
           <w:numId w:val="2"/>
         </w:numPr>
         <w:spacing w:before="100" w:beforeAutospacing="1" w:after="30"/>
-        <w:divId w:val="362943139"/>
+        <w:divId w:val="479421473"/>
         <w:rPr>
           <w:rFonts w:ascii="Arial" w:eastAsia="Times New Roman" w:hAnsi="Arial" w:cs="Arial"/>
           <w:color w:val="000000"/>
@@ -470,7 +470,7 @@
           <w:numId w:val="2"/>
         </w:numPr>
         <w:spacing w:before="100" w:beforeAutospacing="1" w:after="30"/>
-        <w:divId w:val="362943139"/>
+        <w:divId w:val="479421473"/>
         <w:rPr>
           <w:rFonts w:ascii="Arial" w:eastAsia="Times New Roman" w:hAnsi="Arial" w:cs="Arial"/>
           <w:color w:val="000000"/>
@@ -504,7 +504,7 @@
     <w:p>
       <w:pPr>
         <w:pStyle w:val="Heading3"/>
-        <w:divId w:val="203642375"/>
+        <w:divId w:val="882180923"/>
         <w:rPr>
           <w:rFonts w:ascii="Arial" w:eastAsia="Times New Roman" w:hAnsi="Arial" w:cs="Arial"/>
           <w:lang w:val="en"/>
@@ -521,7 +521,7 @@
     <w:p>
       <w:pPr>
         <w:pStyle w:val="job-title"/>
-        <w:divId w:val="1751002817"/>
+        <w:divId w:val="2122410866"/>
         <w:rPr>
           <w:rFonts w:ascii="Arial" w:hAnsi="Arial" w:cs="Arial"/>
           <w:color w:val="000000"/>
@@ -540,7 +540,7 @@
     <w:p>
       <w:pPr>
         <w:pStyle w:val="job-meta"/>
-        <w:divId w:val="1751002817"/>
+        <w:divId w:val="2122410866"/>
         <w:rPr>
           <w:rFonts w:ascii="Arial" w:hAnsi="Arial" w:cs="Arial"/>
           <w:color w:val="000000"/>
@@ -587,7 +587,7 @@
           <w:color w:val="000000"/>
           <w:lang w:val="en"/>
         </w:rPr>
-        <w:t xml:space="preserve"> | Nov 2025 – Present</w:t>
+        <w:t xml:space="preserve"> | Nov 2025 – Jun 2026</w:t>
       </w:r>
     </w:p>
     <w:p>
@@ -597,7 +597,7 @@
           <w:numId w:val="3"/>
         </w:numPr>
         <w:spacing w:before="100" w:beforeAutospacing="1" w:after="30"/>
-        <w:divId w:val="1751002817"/>
+        <w:divId w:val="2122410866"/>
         <w:rPr>
           <w:rFonts w:ascii="Arial" w:eastAsia="Times New Roman" w:hAnsi="Arial" w:cs="Arial"/>
           <w:color w:val="000000"/>
@@ -624,7 +624,7 @@
           <w:numId w:val="3"/>
         </w:numPr>
         <w:spacing w:before="100" w:beforeAutospacing="1" w:after="30"/>
-        <w:divId w:val="1751002817"/>
+        <w:divId w:val="2122410866"/>
         <w:rPr>
           <w:rFonts w:ascii="Arial" w:eastAsia="Times New Roman" w:hAnsi="Arial" w:cs="Arial"/>
           <w:color w:val="000000"/>
@@ -647,7 +647,7 @@
     <w:p>
       <w:pPr>
         <w:pStyle w:val="stack-line"/>
-        <w:divId w:val="1751002817"/>
+        <w:divId w:val="2122410866"/>
         <w:rPr>
           <w:rFonts w:ascii="Arial" w:hAnsi="Arial" w:cs="Arial"/>
           <w:lang w:val="en"/>
@@ -679,7 +679,7 @@
     <w:p>
       <w:pPr>
         <w:pStyle w:val="job-title"/>
-        <w:divId w:val="1982735496"/>
+        <w:divId w:val="950942812"/>
         <w:rPr>
           <w:rFonts w:ascii="Arial" w:hAnsi="Arial" w:cs="Arial"/>
           <w:color w:val="000000"/>
@@ -698,7 +698,7 @@
     <w:p>
       <w:pPr>
         <w:pStyle w:val="job-meta"/>
-        <w:divId w:val="1982735496"/>
+        <w:divId w:val="950942812"/>
         <w:rPr>
           <w:rFonts w:ascii="Arial" w:hAnsi="Arial" w:cs="Arial"/>
           <w:color w:val="000000"/>
@@ -747,7 +747,7 @@
           <w:numId w:val="4"/>
         </w:numPr>
         <w:spacing w:before="100" w:beforeAutospacing="1" w:after="30"/>
-        <w:divId w:val="1982735496"/>
+        <w:divId w:val="950942812"/>
         <w:rPr>
           <w:rFonts w:ascii="Arial" w:eastAsia="Times New Roman" w:hAnsi="Arial" w:cs="Arial"/>
           <w:color w:val="000000"/>
@@ -770,7 +770,7 @@
     <w:p>
       <w:pPr>
         <w:pStyle w:val="stack-line"/>
-        <w:divId w:val="1982735496"/>
+        <w:divId w:val="950942812"/>
         <w:rPr>
           <w:rFonts w:ascii="Arial" w:hAnsi="Arial" w:cs="Arial"/>
           <w:lang w:val="en"/>
@@ -795,7 +795,7 @@
     <w:p>
       <w:pPr>
         <w:pStyle w:val="job-title"/>
-        <w:divId w:val="357775674"/>
+        <w:divId w:val="436026408"/>
         <w:rPr>
           <w:rFonts w:ascii="Arial" w:hAnsi="Arial" w:cs="Arial"/>
           <w:color w:val="000000"/>
@@ -815,7 +815,7 @@
     <w:p>
       <w:pPr>
         <w:pStyle w:val="job-meta"/>
-        <w:divId w:val="357775674"/>
+        <w:divId w:val="436026408"/>
         <w:rPr>
           <w:rFonts w:ascii="Arial" w:hAnsi="Arial" w:cs="Arial"/>
           <w:color w:val="000000"/>
@@ -864,7 +864,7 @@
           <w:numId w:val="5"/>
         </w:numPr>
         <w:spacing w:before="100" w:beforeAutospacing="1" w:after="30"/>
-        <w:divId w:val="357775674"/>
+        <w:divId w:val="436026408"/>
         <w:rPr>
           <w:rFonts w:ascii="Arial" w:eastAsia="Times New Roman" w:hAnsi="Arial" w:cs="Arial"/>
           <w:color w:val="000000"/>
@@ -891,7 +891,7 @@
           <w:numId w:val="5"/>
         </w:numPr>
         <w:spacing w:before="100" w:beforeAutospacing="1" w:after="30"/>
-        <w:divId w:val="357775674"/>
+        <w:divId w:val="436026408"/>
         <w:rPr>
           <w:rFonts w:ascii="Arial" w:eastAsia="Times New Roman" w:hAnsi="Arial" w:cs="Arial"/>
           <w:color w:val="000000"/>
@@ -918,7 +918,7 @@
           <w:numId w:val="5"/>
         </w:numPr>
         <w:spacing w:before="100" w:beforeAutospacing="1" w:after="30"/>
-        <w:divId w:val="357775674"/>
+        <w:divId w:val="436026408"/>
         <w:rPr>
           <w:rFonts w:ascii="Arial" w:eastAsia="Times New Roman" w:hAnsi="Arial" w:cs="Arial"/>
           <w:color w:val="000000"/>
@@ -945,7 +945,7 @@
           <w:numId w:val="5"/>
         </w:numPr>
         <w:spacing w:before="100" w:beforeAutospacing="1" w:after="30"/>
-        <w:divId w:val="357775674"/>
+        <w:divId w:val="436026408"/>
         <w:rPr>
           <w:rFonts w:ascii="Arial" w:eastAsia="Times New Roman" w:hAnsi="Arial" w:cs="Arial"/>
           <w:color w:val="000000"/>
@@ -968,7 +968,7 @@
     <w:p>
       <w:pPr>
         <w:pStyle w:val="stack-line"/>
-        <w:divId w:val="357775674"/>
+        <w:divId w:val="436026408"/>
         <w:rPr>
           <w:rFonts w:ascii="Arial" w:hAnsi="Arial" w:cs="Arial"/>
           <w:lang w:val="en"/>
@@ -1000,7 +1000,7 @@
     <w:p>
       <w:pPr>
         <w:pStyle w:val="job-title"/>
-        <w:divId w:val="2004625660"/>
+        <w:divId w:val="1541741864"/>
         <w:rPr>
           <w:rFonts w:ascii="Arial" w:hAnsi="Arial" w:cs="Arial"/>
           <w:color w:val="000000"/>
@@ -1019,7 +1019,7 @@
     <w:p>
       <w:pPr>
         <w:pStyle w:val="job-meta"/>
-        <w:divId w:val="2004625660"/>
+        <w:divId w:val="1541741864"/>
         <w:rPr>
           <w:rFonts w:ascii="Arial" w:hAnsi="Arial" w:cs="Arial"/>
           <w:color w:val="000000"/>
@@ -1068,7 +1068,7 @@
           <w:numId w:val="6"/>
         </w:numPr>
         <w:spacing w:before="100" w:beforeAutospacing="1" w:after="30"/>
-        <w:divId w:val="2004625660"/>
+        <w:divId w:val="1541741864"/>
         <w:rPr>
           <w:rFonts w:ascii="Arial" w:eastAsia="Times New Roman" w:hAnsi="Arial" w:cs="Arial"/>
           <w:color w:val="000000"/>
@@ -1095,7 +1095,7 @@
           <w:numId w:val="6"/>
         </w:numPr>
         <w:spacing w:before="100" w:beforeAutospacing="1" w:after="30"/>
-        <w:divId w:val="2004625660"/>
+        <w:divId w:val="1541741864"/>
         <w:rPr>
           <w:rFonts w:ascii="Arial" w:eastAsia="Times New Roman" w:hAnsi="Arial" w:cs="Arial"/>
           <w:color w:val="000000"/>
@@ -1122,7 +1122,7 @@
           <w:numId w:val="6"/>
         </w:numPr>
         <w:spacing w:before="100" w:beforeAutospacing="1" w:after="30"/>
-        <w:divId w:val="2004625660"/>
+        <w:divId w:val="1541741864"/>
         <w:rPr>
           <w:rFonts w:ascii="Arial" w:eastAsia="Times New Roman" w:hAnsi="Arial" w:cs="Arial"/>
           <w:color w:val="000000"/>
@@ -1145,7 +1145,7 @@
     <w:p>
       <w:pPr>
         <w:pStyle w:val="stack-line"/>
-        <w:divId w:val="2004625660"/>
+        <w:divId w:val="1541741864"/>
         <w:rPr>
           <w:rFonts w:ascii="Arial" w:hAnsi="Arial" w:cs="Arial"/>
           <w:lang w:val="en"/>
@@ -1170,7 +1170,7 @@
     <w:p>
       <w:pPr>
         <w:pStyle w:val="job-title"/>
-        <w:divId w:val="761029336"/>
+        <w:divId w:val="1262639367"/>
         <w:rPr>
           <w:rFonts w:ascii="Arial" w:hAnsi="Arial" w:cs="Arial"/>
           <w:color w:val="000000"/>
@@ -1189,7 +1189,7 @@
     <w:p>
       <w:pPr>
         <w:pStyle w:val="job-meta"/>
-        <w:divId w:val="761029336"/>
+        <w:divId w:val="1262639367"/>
         <w:rPr>
           <w:rFonts w:ascii="Arial" w:hAnsi="Arial" w:cs="Arial"/>
           <w:color w:val="000000"/>
@@ -1238,7 +1238,7 @@
           <w:numId w:val="7"/>
         </w:numPr>
         <w:spacing w:before="100" w:beforeAutospacing="1" w:after="30"/>
-        <w:divId w:val="761029336"/>
+        <w:divId w:val="1262639367"/>
         <w:rPr>
           <w:rFonts w:ascii="Arial" w:eastAsia="Times New Roman" w:hAnsi="Arial" w:cs="Arial"/>
           <w:color w:val="000000"/>
@@ -1265,7 +1265,7 @@
           <w:numId w:val="7"/>
         </w:numPr>
         <w:spacing w:before="100" w:beforeAutospacing="1" w:after="30"/>
-        <w:divId w:val="761029336"/>
+        <w:divId w:val="1262639367"/>
         <w:rPr>
           <w:rFonts w:ascii="Arial" w:eastAsia="Times New Roman" w:hAnsi="Arial" w:cs="Arial"/>
           <w:color w:val="000000"/>
@@ -1288,7 +1288,7 @@
     <w:p>
       <w:pPr>
         <w:pStyle w:val="stack-line"/>
-        <w:divId w:val="761029336"/>
+        <w:divId w:val="1262639367"/>
         <w:rPr>
           <w:rFonts w:ascii="Arial" w:hAnsi="Arial" w:cs="Arial"/>
           <w:lang w:val="en"/>
@@ -1320,7 +1320,7 @@
     <w:p>
       <w:pPr>
         <w:pStyle w:val="job-title"/>
-        <w:divId w:val="1889950710"/>
+        <w:divId w:val="801115512"/>
         <w:rPr>
           <w:rFonts w:ascii="Arial" w:hAnsi="Arial" w:cs="Arial"/>
           <w:color w:val="000000"/>
@@ -1339,7 +1339,7 @@
     <w:p>
       <w:pPr>
         <w:pStyle w:val="job-meta"/>
-        <w:divId w:val="1889950710"/>
+        <w:divId w:val="801115512"/>
         <w:rPr>
           <w:rFonts w:ascii="Arial" w:hAnsi="Arial" w:cs="Arial"/>
           <w:color w:val="000000"/>
@@ -1388,7 +1388,7 @@
           <w:numId w:val="8"/>
         </w:numPr>
         <w:spacing w:before="100" w:beforeAutospacing="1" w:after="30"/>
-        <w:divId w:val="1889950710"/>
+        <w:divId w:val="801115512"/>
         <w:rPr>
           <w:rFonts w:ascii="Arial" w:eastAsia="Times New Roman" w:hAnsi="Arial" w:cs="Arial"/>
           <w:color w:val="000000"/>
@@ -1411,7 +1411,7 @@
     <w:p>
       <w:pPr>
         <w:pStyle w:val="stack-line"/>
-        <w:divId w:val="1889950710"/>
+        <w:divId w:val="801115512"/>
         <w:rPr>
           <w:rFonts w:ascii="Arial" w:hAnsi="Arial" w:cs="Arial"/>
           <w:lang w:val="en"/>
@@ -1436,7 +1436,7 @@
     <w:p>
       <w:pPr>
         <w:pStyle w:val="Heading3"/>
-        <w:divId w:val="1484200879"/>
+        <w:divId w:val="1466579214"/>
         <w:rPr>
           <w:rFonts w:ascii="Arial" w:eastAsia="Times New Roman" w:hAnsi="Arial" w:cs="Arial"/>
           <w:lang w:val="en"/>
@@ -1453,7 +1453,7 @@
     <w:p>
       <w:pPr>
         <w:pStyle w:val="job-title"/>
-        <w:divId w:val="2128503624"/>
+        <w:divId w:val="132793985"/>
         <w:rPr>
           <w:rFonts w:ascii="Arial" w:hAnsi="Arial" w:cs="Arial"/>
           <w:color w:val="000000"/>
@@ -1472,7 +1472,7 @@
     <w:p>
       <w:pPr>
         <w:pStyle w:val="job-meta"/>
-        <w:divId w:val="2128503624"/>
+        <w:divId w:val="132793985"/>
         <w:rPr>
           <w:rFonts w:ascii="Arial" w:hAnsi="Arial" w:cs="Arial"/>
           <w:color w:val="000000"/>
@@ -1509,7 +1509,7 @@
     <w:p>
       <w:pPr>
         <w:pStyle w:val="Heading3"/>
-        <w:divId w:val="1324701621"/>
+        <w:divId w:val="1963683777"/>
         <w:rPr>
           <w:rFonts w:ascii="Arial" w:eastAsia="Times New Roman" w:hAnsi="Arial" w:cs="Arial"/>
           <w:lang w:val="en"/>
@@ -1526,7 +1526,7 @@
     <w:p>
       <w:pPr>
         <w:pStyle w:val="job-title"/>
-        <w:divId w:val="471338487"/>
+        <w:divId w:val="1625651571"/>
         <w:rPr>
           <w:rFonts w:ascii="Arial" w:hAnsi="Arial" w:cs="Arial"/>
           <w:color w:val="000000"/>
@@ -1545,7 +1545,7 @@
     <w:p>
       <w:pPr>
         <w:pStyle w:val="job-title"/>
-        <w:divId w:val="1474909419"/>
+        <w:divId w:val="1789549350"/>
         <w:rPr>
           <w:rFonts w:ascii="Arial" w:hAnsi="Arial" w:cs="Arial"/>
           <w:color w:val="000000"/>
@@ -1565,7 +1565,7 @@
     <w:p>
       <w:pPr>
         <w:pStyle w:val="Heading3"/>
-        <w:divId w:val="128481694"/>
+        <w:divId w:val="628753842"/>
         <w:rPr>
           <w:rFonts w:ascii="Arial" w:eastAsia="Times New Roman" w:hAnsi="Arial" w:cs="Arial"/>
           <w:lang w:val="en"/>
@@ -1586,7 +1586,7 @@
           <w:numId w:val="9"/>
         </w:numPr>
         <w:spacing w:before="100" w:beforeAutospacing="1" w:after="30"/>
-        <w:divId w:val="128481694"/>
+        <w:divId w:val="628753842"/>
         <w:rPr>
           <w:rFonts w:ascii="Arial" w:eastAsia="Times New Roman" w:hAnsi="Arial" w:cs="Arial"/>
           <w:color w:val="000000"/>
@@ -1672,9 +1672,9 @@
 <file path=word/numbering.xml><?xml version="1.0" encoding="utf-8"?>
 <w:numbering xmlns:wpc="http://schemas.microsoft.com/office/word/2010/wordprocessingCanvas" xmlns:cx="http://schemas.microsoft.com/office/drawing/2014/chartex" xmlns:cx1="http://schemas.microsoft.com/office/drawing/2015/9/8/chartex" xmlns:cx2="http://schemas.microsoft.com/office/drawing/2015/10/21/chartex" xmlns:cx3="http://schemas.microsoft.com/office/drawing/2016/5/9/chartex" xmlns:cx4="http://schemas.microsoft.com/office/drawing/2016/5/10/chartex" xmlns:cx5="http://schemas.microsoft.com/office/drawing/2016/5/11/chartex" xmlns:cx6="http://schemas.microsoft.com/office/drawing/2016/5/12/chartex" xmlns:cx7="http://schemas.microsoft.com/office/drawing/2016/5/13/chartex" xmlns:cx8="http://schemas.microsoft.com/office/drawing/2016/5/14/chartex" xmlns:mc="http://schemas.openxmlformats.org/markup-compatibility/2006" xmlns:aink="http://schemas.microsoft.com/office/drawing/2016/ink" xmlns:am3d="http://schemas.microsoft.com/office/drawing/2017/model3d" xmlns:o="urn:schemas-microsoft-com:office:office" xmlns:oel="http://schemas.microsoft.com/office/2019/extlst" xmlns:r="http://schemas.openxmlformats.org/officeDocument/2006/relationships" xmlns:m="http://schemas.openxmlformats.org/officeDocument/2006/math" xmlns:v="urn:schemas-microsoft-com:vml" xmlns:wp14="http://schemas.microsoft.com/office/word/2010/wordprocessingDrawing" xmlns:wp="http://schemas.openxmlformats.org/drawingml/2006/wordprocessingDrawing" xmlns:w10="urn:schemas-microsoft-com:office:word" xmlns:w="http://schemas.openxmlformats.org/wordprocessingml/2006/main" xmlns:w14="http://schemas.microsoft.com/office/word/2010/wordml" xmlns:w15="http://schemas.microsoft.com/office/word/2012/wordml" xmlns:w16cex="http://schemas.microsoft.com/office/word/2018/wordml/cex" xmlns:w16cid="http://schemas.microsoft.com/office/word/2016/wordml/cid" xmlns:w16="http://schemas.microsoft.com/office/word/2018/wordml" xmlns:w16du="http://schemas.microsoft.com/office/word/2023/wordml/word16du" xmlns:w16sdtdh="http://schemas.microsoft.com/office/word/2020/wordml/sdtdatahash" xmlns:w16sdtfl="http://schemas.microsoft.com/office/word/2024/wordml/sdtformatlock" xmlns:w16se="http://schemas.microsoft.com/office/word/2015/wordml/symex" xmlns:wpg="http://schemas.microsoft.com/office/word/2010/wordprocessingGroup" xmlns:wpi="http://schemas.microsoft.com/office/word/2010/wordprocessingInk" xmlns:wne="http://schemas.microsoft.com/office/word/2006/wordml" xmlns:wps="http://schemas.microsoft.com/office/word/2010/wordprocessingShape" mc:Ignorable="w14 w15 w16se w16cid w16 w16cex w16sdtdh w16sdtfl w16du wp14">
   <w:abstractNum w:abstractNumId="0" w15:restartNumberingAfterBreak="0">
-    <w:nsid w:val="026F0169"/>
+    <w:nsid w:val="1EB36EC7"/>
     <w:multiLevelType w:val="multilevel"/>
-    <w:tmpl w:val="8D8E1BF0"/>
+    <w:tmpl w:val="4742FB84"/>
     <w:lvl w:ilvl="0">
       <w:start w:val="1"/>
       <w:numFmt w:val="bullet"/>
@@ -1821,9 +1821,9 @@
     </w:lvl>
   </w:abstractNum>
   <w:abstractNum w:abstractNumId="1" w15:restartNumberingAfterBreak="0">
-    <w:nsid w:val="0B3768EB"/>
+    <w:nsid w:val="23AC4804"/>
     <w:multiLevelType w:val="multilevel"/>
-    <w:tmpl w:val="95349290"/>
+    <w:tmpl w:val="62025174"/>
     <w:lvl w:ilvl="0">
       <w:start w:val="1"/>
       <w:numFmt w:val="bullet"/>
@@ -1970,9 +1970,9 @@
     </w:lvl>
   </w:abstractNum>
   <w:abstractNum w:abstractNumId="2" w15:restartNumberingAfterBreak="0">
-    <w:nsid w:val="2E0D634D"/>
+    <w:nsid w:val="268B5211"/>
     <w:multiLevelType w:val="multilevel"/>
-    <w:tmpl w:val="79F424FE"/>
+    <w:tmpl w:val="2FE81E0A"/>
     <w:lvl w:ilvl="0">
       <w:start w:val="1"/>
       <w:numFmt w:val="bullet"/>
@@ -2119,9 +2119,9 @@
     </w:lvl>
   </w:abstractNum>
   <w:abstractNum w:abstractNumId="3" w15:restartNumberingAfterBreak="0">
-    <w:nsid w:val="318A2DC6"/>
+    <w:nsid w:val="2D106B65"/>
     <w:multiLevelType w:val="multilevel"/>
-    <w:tmpl w:val="956255C2"/>
+    <w:tmpl w:val="98D6C8C8"/>
     <w:lvl w:ilvl="0">
       <w:start w:val="1"/>
       <w:numFmt w:val="bullet"/>
@@ -2268,9 +2268,9 @@
     </w:lvl>
   </w:abstractNum>
   <w:abstractNum w:abstractNumId="4" w15:restartNumberingAfterBreak="0">
-    <w:nsid w:val="35E3060C"/>
+    <w:nsid w:val="58C42DE4"/>
     <w:multiLevelType w:val="multilevel"/>
-    <w:tmpl w:val="1368F718"/>
+    <w:tmpl w:val="9118B2DE"/>
     <w:lvl w:ilvl="0">
       <w:start w:val="1"/>
       <w:numFmt w:val="bullet"/>
@@ -2417,9 +2417,9 @@
     </w:lvl>
   </w:abstractNum>
   <w:abstractNum w:abstractNumId="5" w15:restartNumberingAfterBreak="0">
-    <w:nsid w:val="3BB72567"/>
+    <w:nsid w:val="628F5828"/>
     <w:multiLevelType w:val="multilevel"/>
-    <w:tmpl w:val="12B277EE"/>
+    <w:tmpl w:val="5DFAAB46"/>
     <w:lvl w:ilvl="0">
       <w:start w:val="1"/>
       <w:numFmt w:val="bullet"/>
@@ -2566,9 +2566,9 @@
     </w:lvl>
   </w:abstractNum>
   <w:abstractNum w:abstractNumId="6" w15:restartNumberingAfterBreak="0">
-    <w:nsid w:val="597C27D3"/>
+    <w:nsid w:val="64B07B1F"/>
     <w:multiLevelType w:val="multilevel"/>
-    <w:tmpl w:val="229C47AC"/>
+    <w:tmpl w:val="4BC2C9C2"/>
     <w:lvl w:ilvl="0">
       <w:start w:val="1"/>
       <w:numFmt w:val="bullet"/>
@@ -2715,9 +2715,9 @@
     </w:lvl>
   </w:abstractNum>
   <w:abstractNum w:abstractNumId="7" w15:restartNumberingAfterBreak="0">
-    <w:nsid w:val="72C71F1F"/>
+    <w:nsid w:val="6EF039CC"/>
     <w:multiLevelType w:val="multilevel"/>
-    <w:tmpl w:val="51D0FF2E"/>
+    <w:tmpl w:val="111E2992"/>
     <w:lvl w:ilvl="0">
       <w:start w:val="1"/>
       <w:numFmt w:val="bullet"/>
@@ -2864,9 +2864,9 @@
     </w:lvl>
   </w:abstractNum>
   <w:abstractNum w:abstractNumId="8" w15:restartNumberingAfterBreak="0">
-    <w:nsid w:val="7FFC3FF9"/>
+    <w:nsid w:val="72CF42C4"/>
     <w:multiLevelType w:val="multilevel"/>
-    <w:tmpl w:val="CA3E3B0A"/>
+    <w:tmpl w:val="26E802A0"/>
     <w:lvl w:ilvl="0">
       <w:start w:val="1"/>
       <w:numFmt w:val="bullet"/>
@@ -3012,32 +3012,32 @@
       </w:rPr>
     </w:lvl>
   </w:abstractNum>
-  <w:num w:numId="1" w16cid:durableId="2146770173">
-    <w:abstractNumId w:val="4"/>
+  <w:num w:numId="1" w16cid:durableId="392585372">
+    <w:abstractNumId w:val="1"/>
   </w:num>
-  <w:num w:numId="2" w16cid:durableId="1132361049">
+  <w:num w:numId="2" w16cid:durableId="430274942">
+    <w:abstractNumId w:val="7"/>
+  </w:num>
+  <w:num w:numId="3" w16cid:durableId="1500922487">
+    <w:abstractNumId w:val="6"/>
+  </w:num>
+  <w:num w:numId="4" w16cid:durableId="1528787850">
+    <w:abstractNumId w:val="2"/>
+  </w:num>
+  <w:num w:numId="5" w16cid:durableId="667095608">
+    <w:abstractNumId w:val="3"/>
+  </w:num>
+  <w:num w:numId="6" w16cid:durableId="580602530">
     <w:abstractNumId w:val="5"/>
   </w:num>
-  <w:num w:numId="3" w16cid:durableId="685908769">
+  <w:num w:numId="7" w16cid:durableId="1522235595">
+    <w:abstractNumId w:val="0"/>
+  </w:num>
+  <w:num w:numId="8" w16cid:durableId="157160493">
     <w:abstractNumId w:val="8"/>
   </w:num>
-  <w:num w:numId="4" w16cid:durableId="703792324">
-    <w:abstractNumId w:val="3"/>
-  </w:num>
-  <w:num w:numId="5" w16cid:durableId="364866514">
-    <w:abstractNumId w:val="0"/>
-  </w:num>
-  <w:num w:numId="6" w16cid:durableId="135879455">
-    <w:abstractNumId w:val="1"/>
-  </w:num>
-  <w:num w:numId="7" w16cid:durableId="437414786">
-    <w:abstractNumId w:val="7"/>
-  </w:num>
-  <w:num w:numId="8" w16cid:durableId="1481195416">
-    <w:abstractNumId w:val="2"/>
-  </w:num>
-  <w:num w:numId="9" w16cid:durableId="166100740">
-    <w:abstractNumId w:val="6"/>
+  <w:num w:numId="9" w16cid:durableId="1310552659">
+    <w:abstractNumId w:val="4"/>
   </w:num>
 </w:numbering>
 </file>

</xml_diff>